<commit_message>
briefs: stripe.com drafts regenerated from rep feedback; re-render reports
Generated with [Devin](https://devin.ai)

Co-Authored-By: Devin <158243242+devin-ai-integration[bot]@users.noreply.github.com>
</commit_message>
<xml_diff>
--- a/briefs/stripe.com/2026-10-10.docx
+++ b/briefs/stripe.com/2026-10-10.docx
@@ -2487,7 +2487,7 @@
                 <w:color w:val="1F2937"/>
                 <w:sz w:val="22"/>
               </w:rPr>
-              <w:t>Congrats on taking over Developer Infrastructure. Stripe already has Claude Code set up on every developer's machine, so I'd guess the next question is which work agents should own beyond the editor.</w:t>
+              <w:t>Congrats on taking over Developer Infrastructure. Stripe already has Claude Code set up on every developer's machine, so the next question for your org is which work agents should own beyond the editor.</w:t>
             </w:r>
           </w:p>
           <w:p>
@@ -2517,7 +2517,7 @@
                 <w:color w:val="1F2937"/>
                 <w:sz w:val="22"/>
               </w:rPr>
-              <w:t>That's where Devin tends to land: it picks up a scoped ticket, runs the tests in its own sandbox and opens a PR for your engineers to review. On migration work, Nubank reports an 8x engineering time efficiency gain (https://devin.ai/customers/nubank/).</w:t>
+              <w:t>That's where Devin fits. It takes a scoped ticket and hands back a PR, with the tests already run in its own sandbox. On migration work, Nubank reports an 8x engineering time efficiency gain (https://devin.ai/customers/nubank/).</w:t>
             </w:r>
           </w:p>
           <w:p>
@@ -2547,7 +2547,7 @@
                 <w:color w:val="1F2937"/>
                 <w:sz w:val="22"/>
               </w:rPr>
-              <w:t>Would a short call sometime this week or next be useful to map where that could sit next to what you already run?</w:t>
+              <w:t>Can we set up 20 minutes to chat sometime this week or next?</w:t>
             </w:r>
           </w:p>
           <w:p>
@@ -2607,7 +2607,7 @@
                 <w:color w:val="1F2937"/>
                 <w:sz w:val="20"/>
               </w:rPr>
-              <w:t>Hi Thomas, congrats on the move to Head of Developer Infrastructure at Stripe. I work with platform teams deciding which engineering work to hand to agents next, and would be glad to connect.</w:t>
+              <w:t>Hi Thomas, congrats on the move to Head of Developer Infrastructure at Stripe. I work with platform teams deciding which engineering work to hand to agents next. Would love to connect.</w:t>
             </w:r>
           </w:p>
           <w:p>
@@ -2637,7 +2637,7 @@
                 <w:color w:val="1F2937"/>
                 <w:sz w:val="20"/>
               </w:rPr>
-              <w:t>Thanks for connecting, Thomas. With Claude Code already set up on every developer's machine at Stripe, the question I hear from infra leaders is what comes after the editor: migrations, upgrades and backlog work nobody wants to babysit. Devin takes a scoped ticket, works in its own sandbox and hands back a PR with tests run. If it helps as you plan your first quarter, I can walk you through how other platform teams split that work between in-house tools and an agent. Open to a short call?</w:t>
+              <w:t>Thanks for connecting, Thomas. With Claude Code already on every developer's machine at Stripe, the infra leaders I talk to are deciding what comes after the editor. Usually that's the migration and upgrade work sitting in the backlog because nobody wants to babysit it. Devin works through that kind of change in its own environment and opens a PR your team reviews like any other. As you plan your first quarter in the role, it's worth seeing how other platform teams split that work. Can we find 20 minutes?</w:t>
             </w:r>
           </w:p>
           <w:tbl>
@@ -2694,7 +2694,7 @@
                       <w:color w:val="6B7280"/>
                       <w:sz w:val="16"/>
                     </w:rPr>
-                    <w:t>- New in role: lead with what his org owns next, not with what it already shipped</w:t>
+                    <w:t>- Never frame Devin as a swap for Claude Code; it's already in production, so pitch expansion</w:t>
                   </w:r>
                 </w:p>
                 <w:p>
@@ -2709,22 +2709,7 @@
                       <w:color w:val="6B7280"/>
                       <w:sz w:val="16"/>
                     </w:rPr>
-                    <w:t>- Claude Code is in production; frame Devin as expansion, never a swap</w:t>
-                  </w:r>
-                </w:p>
-                <w:p>
-                  <w:pPr>
-                    <w:spacing w:before="0" w:after="8" w:line="269" w:lineRule="auto"/>
-                  </w:pPr>
-                  <w:r>
-                    <w:rPr>
-                      <w:rFonts w:ascii="Arial" w:hAnsi="Arial" w:cs="Arial" w:eastAsia="Arial"/>
-                      <w:b w:val="0"/>
-                      <w:i w:val="0"/>
-                      <w:color w:val="6B7280"/>
-                      <w:sz w:val="16"/>
-                    </w:rPr>
-                    <w:t>- Do not mention his predecessor's departure</w:t>
+                    <w:t>- Don't mention his predecessor's departure</w:t>
                   </w:r>
                 </w:p>
                 <w:p>
@@ -2914,7 +2899,7 @@
                 <w:color w:val="1F2937"/>
                 <w:sz w:val="22"/>
               </w:rPr>
-              <w:t>Minions now sit behind a big share of Stripe's pull requests, and you're hiring an EM to lead the DevProd AI team. So the question on your desk is probably less whether agents work and more which work goes to which agent.</w:t>
+              <w:t>Minions now sit behind a big share of Stripe's pull requests, and I saw you're hiring an EM to lead the DevProd AI team. The question on your desk is no longer whether agents work. It's which work goes to which agent.</w:t>
             </w:r>
           </w:p>
           <w:p>
@@ -2944,7 +2929,7 @@
                 <w:color w:val="1F2937"/>
                 <w:sz w:val="22"/>
               </w:rPr>
-              <w:t>My hypothesis is that there is a long tail of cross-repo upgrades and cleanup worth routing to a second agent instead of building harness support for each case. Devin takes that kind of ticket from Slack or Jira and returns a review-ready PR. At EBANX, 92% of merged PRs are authored by Devin (https://devin.ai/customers/ebanx).</w:t>
+              <w:t>There's a long tail of cross-repo upgrades worth routing to a second agent instead of building harness support for each case. Devin takes that kind of ticket from Slack or Jira and returns a review-ready PR. At EBANX, 92% of merged PRs are authored by Devin (https://devin.ai/customers/ebanx).</w:t>
             </w:r>
           </w:p>
           <w:p>
@@ -2974,7 +2959,7 @@
                 <w:color w:val="1F2937"/>
                 <w:sz w:val="22"/>
               </w:rPr>
-              <w:t>Open to 20 minutes on how teams with their own agent platform draw that line?</w:t>
+              <w:t>Open to 20 minutes to chat?</w:t>
             </w:r>
           </w:p>
           <w:p>
@@ -3034,7 +3019,7 @@
                 <w:color w:val="1F2937"/>
                 <w:sz w:val="20"/>
               </w:rPr>
-              <w:t>Hi Shepherd, the Minions write-ups are some of the most useful material out there on running unattended agents in a large codebase. I work on agent rollouts with platform teams and would like to connect.</w:t>
+              <w:t>Hi Shepherd, the Minions write-ups are some of the most useful material out there on running unattended agents in a large codebase. I work on agent rollouts with platform teams and would love to connect.</w:t>
             </w:r>
           </w:p>
           <w:p>
@@ -3064,7 +3049,7 @@
                 <w:color w:val="1F2937"/>
                 <w:sz w:val="20"/>
               </w:rPr>
-              <w:t>Thanks for connecting, Shepherd. Once a team owns its own agent platform, my conversations tend to be about governance: which classes of work go to which agent, who reviews the output, and how you measure whether it pays off. Some teams in that spot use Devin for categories they would rather not build harness support for, like large upgrades or long-running cleanup. If 20 minutes on how others draw that line would help as you staff up DevProd AI, I'm happy to set it up.</w:t>
+              <w:t>Thanks for connecting, Shepherd. Once a team owns its own agent platform, the conversation shifts to governance, mostly deciding which classes of work go to which agent and how you know it paid off. Some teams in that spot hand Devin the categories they'd rather not build harness support for, like large upgrades or long-running cleanup. That keeps their own engineers focused on the platform itself instead of on edge cases. Can we set up 20 minutes to chat as you staff up DevProd AI?</w:t>
             </w:r>
           </w:p>
           <w:tbl>
@@ -3121,7 +3106,7 @@
                       <w:color w:val="6B7280"/>
                       <w:sz w:val="16"/>
                     </w:rPr>
-                    <w:t>- Incumbent owner: his team built Minions, so pitch expansion around it, never replacement</w:t>
+                    <w:t>- Never pitch replacing Minions; his team built it, so frame Devin as expansion around it</w:t>
                   </w:r>
                 </w:p>
                 <w:p>
@@ -3136,7 +3121,7 @@
                       <w:color w:val="6B7280"/>
                       <w:sz w:val="16"/>
                     </w:rPr>
-                    <w:t>- Strategy owner: keep it at routing and governance, no feature tour</w:t>
+                    <w:t>- Don't ask whether they've tried agents</w:t>
                   </w:r>
                 </w:p>
                 <w:p>
@@ -3151,7 +3136,7 @@
                       <w:color w:val="6B7280"/>
                       <w:sz w:val="16"/>
                     </w:rPr>
-                    <w:t>- Do not ask whether they have tried agents</w:t>
+                    <w:t>- Keep it at routing and governance, no feature tour</w:t>
                   </w:r>
                 </w:p>
                 <w:p>
@@ -3341,7 +3326,7 @@
                 <w:color w:val="1F2937"/>
                 <w:sz w:val="22"/>
               </w:rPr>
-              <w:t>Your org owns the inner development and test loop at Stripe, and with Selective Test Execution on a 50M-line Ruby monorepo, CI speed looks well covered. What tends to stay stuck in codebases that size is the list of services with thin tests.</w:t>
+              <w:t>Your org owns the inner development and test loop at Stripe, and with Selective Test Execution on a 50M-line Ruby monorepo, CI speed is well covered. What stays stuck in a codebase that size is the list of services with thin tests.</w:t>
             </w:r>
           </w:p>
           <w:p>
@@ -3371,7 +3356,7 @@
                 <w:color w:val="1F2937"/>
                 <w:sz w:val="22"/>
               </w:rPr>
-              <w:t>Devin works in its own environment, writes the missing tests against the existing suite and opens a PR your engineers review like any other change. Litera reports 93% faster regression cycles after rolling it out (https://devin.ai/customers/litera).</w:t>
+              <w:t>Devin writes the missing tests against the existing suite in its own environment, then opens a PR your engineers review like any other change. Litera reports 93% faster regression cycles after rolling it out (https://devin.ai/customers/litera).</w:t>
             </w:r>
           </w:p>
           <w:p>
@@ -3401,7 +3386,7 @@
                 <w:color w:val="1F2937"/>
                 <w:sz w:val="22"/>
               </w:rPr>
-              <w:t>Would a short session on what that looks like for one service in your monorepo be worth it? Any day this week or next works for me.</w:t>
+              <w:t>Can we grab 20 minutes this week or next?</w:t>
             </w:r>
           </w:p>
           <w:p>
@@ -3461,7 +3446,7 @@
                 <w:color w:val="1F2937"/>
                 <w:sz w:val="20"/>
               </w:rPr>
-              <w:t>Hi James, I've been reading Stripe's write-up on Selective Test Execution and how your team keeps the dev and test loop fast. I work with dev tooling teams on agent-written tests and would like to connect.</w:t>
+              <w:t>Hi James, I've been reading Stripe's write-up on Selective Test Execution and how your team keeps the dev and test loop fast. I work with dev tooling teams on agent-written tests and would love to connect.</w:t>
             </w:r>
           </w:p>
           <w:p>
@@ -3491,7 +3476,7 @@
                 <w:color w:val="1F2937"/>
                 <w:sz w:val="20"/>
               </w:rPr>
-              <w:t>Thanks for connecting, James. One pattern I see in large monorepos: the test loop gets fast, but the backlog of services with thin coverage stays put because nobody owns writing those tests. Devin can take that list, write tests against the existing suite in its own environment and open PRs your engineers review like any other change. If you have a service with known gaps, I'd be glad to show what a first pass looks like on it. Does a short call make sense?</w:t>
+              <w:t>Thanks for connecting, James. A pattern I see in large monorepos is that the test loop gets fast, but the backlog of services with thin coverage stays put because nobody owns writing those tests. Devin can take that list and work through it service by service, so coverage climbs without pulling engineers off feature work. If you have a service with known gaps, a first pass on it is the easiest way to judge the output. Open to a short chat?</w:t>
             </w:r>
           </w:p>
           <w:tbl>
@@ -3548,7 +3533,7 @@
                       <w:color w:val="6B7280"/>
                       <w:sz w:val="16"/>
                     </w:rPr>
-                    <w:t>- Technical evaluator: talk about how it runs in his environments and test loop</w:t>
+                    <w:t>- Don't position tests as replacing Claude Code or Minions; they're in production, so this is remainder work they don't cover</w:t>
                   </w:r>
                 </w:p>
                 <w:p>
@@ -3563,22 +3548,7 @@
                       <w:color w:val="6B7280"/>
                       <w:sz w:val="16"/>
                     </w:rPr>
-                    <w:t>- Claude Code and Minions are in production; position tests as remainder work they do not cover</w:t>
-                  </w:r>
-                </w:p>
-                <w:p>
-                  <w:pPr>
-                    <w:spacing w:before="0" w:after="8" w:line="269" w:lineRule="auto"/>
-                  </w:pPr>
-                  <w:r>
-                    <w:rPr>
-                      <w:rFonts w:ascii="Arial" w:hAnsi="Arial" w:cs="Arial" w:eastAsia="Arial"/>
-                      <w:b w:val="0"/>
-                      <w:i w:val="0"/>
-                      <w:color w:val="6B7280"/>
-                      <w:sz w:val="16"/>
-                    </w:rPr>
-                    <w:t>- No pricing or exec framing</w:t>
+                    <w:t>- Keep it to how it runs in his test loop, no pricing or exec framing</w:t>
                   </w:r>
                 </w:p>
                 <w:p>
@@ -3798,7 +3768,7 @@
                 <w:color w:val="1F2937"/>
                 <w:sz w:val="22"/>
               </w:rPr>
-              <w:t>If that is the bet, the pressure moves to the work around shipping: upgrades, cleanup and backlog that grows with every new product. That is the work Devin takes off a team's plate. Ramp says Devin fixes tens of thousands of hours of technical debt (https://devin.ai/customers/ramp/).</w:t>
+              <w:t>If that's the bet, the pressure moves to the maintenance work that grows with every new product. That's the work Devin takes off a team's plate. Ramp says Devin fixes tens of thousands of hours of technical debt (https://devin.ai/customers/ramp/).</w:t>
             </w:r>
           </w:p>
           <w:p>
@@ -3828,7 +3798,7 @@
                 <w:color w:val="1F2937"/>
                 <w:sz w:val="22"/>
               </w:rPr>
-              <w:t>Would a 20 minute conversation with your developer productivity leads be worth setting up?</w:t>
+              <w:t>Can we set up 20 minutes with you and your developer productivity leads?</w:t>
             </w:r>
           </w:p>
           <w:p>
@@ -3888,7 +3858,7 @@
                 <w:color w:val="1F2937"/>
                 <w:sz w:val="20"/>
               </w:rPr>
-              <w:t>Hi Will, enjoyed your a16z conversation on Stripe and agentic coding. Would be glad to connect.</w:t>
+              <w:t>Hi Will, enjoyed your a16z conversation on Stripe and agentic coding. Would love to connect.</w:t>
             </w:r>
           </w:p>
           <w:p>
@@ -3918,7 +3888,7 @@
                 <w:color w:val="1F2937"/>
                 <w:sz w:val="20"/>
               </w:rPr>
-              <w:t>Thanks for connecting, Will. The short version of why I reached out: if Stripe keeps choosing to build more rather than cut, the work around shipping (upgrades, cleanup, backlog) grows with every product line, and that is work an agent can take off your platform teams without changing how they review code. Ramp uses Devin on exactly that kind of technical debt. If useful, I would suggest a short call with whoever owns developer productivity, with you involved only as needed.</w:t>
+              <w:t>Thanks for connecting, Will. Here's why I reached out: if Stripe keeps choosing to build more rather than cut, the maintenance work around shipping grows with every product line. An agent can take that off your platform teams without changing how they review code, which keeps the build-more bet from turning into a backlog. A short call with whoever owns developer productivity is the right next step, with you involved only as needed. Can we set that up?</w:t>
             </w:r>
           </w:p>
           <w:tbl>
@@ -3975,7 +3945,7 @@
                       <w:color w:val="6B7280"/>
                       <w:sz w:val="16"/>
                     </w:rPr>
-                    <w:t>- Exec sponsor: mandate plus proof plus one ask, no product tour</w:t>
+                    <w:t>- Never frame Devin as a way to cut engineering cost; he explicitly rejects that</w:t>
                   </w:r>
                 </w:p>
                 <w:p>
@@ -3991,21 +3961,6 @@
                       <w:sz w:val="16"/>
                     </w:rPr>
                     <w:t>- Email is the primary channel; LinkedIn note is a light touch only</w:t>
-                  </w:r>
-                </w:p>
-                <w:p>
-                  <w:pPr>
-                    <w:spacing w:before="0" w:after="8" w:line="269" w:lineRule="auto"/>
-                  </w:pPr>
-                  <w:r>
-                    <w:rPr>
-                      <w:rFonts w:ascii="Arial" w:hAnsi="Arial" w:cs="Arial" w:eastAsia="Arial"/>
-                      <w:b w:val="0"/>
-                      <w:i w:val="0"/>
-                      <w:color w:val="6B7280"/>
-                      <w:sz w:val="16"/>
-                    </w:rPr>
-                    <w:t>- Never frame Devin as a way to cut engineering cost; he explicitly rejects that</w:t>
                   </w:r>
                 </w:p>
                 <w:p>
@@ -4195,7 +4150,7 @@
                 <w:color w:val="1F2937"/>
                 <w:sz w:val="22"/>
               </w:rPr>
-              <w:t>You lead developer productivity for Go and Schemas at Stripe, and the AI-agent tooling you led cut build failures and CI/CD cost by about 30% each. That is a team that already knows where agents pay off.</w:t>
+              <w:t>You lead developer productivity for Go and Schemas at Stripe, and the AI-agent tooling you led cut build failures and CI/CD cost by about 30% each. That's a team that already knows where agents pay off.</w:t>
             </w:r>
           </w:p>
           <w:p>
@@ -4225,7 +4180,7 @@
                 <w:color w:val="1F2937"/>
                 <w:sz w:val="22"/>
               </w:rPr>
-              <w:t>Devin could take the next layer of that work: dependency bumps and schema-driven changes across services, done in its own sandbox with the build run before a PR reaches review. Itaú reports a 6x faster .NET to Java migration of 59 services (https://devin.ai/customers/itau).</w:t>
+              <w:t>The next layer is the change work itself, like schema-driven changes that ripple across services. Devin handles those in its own sandbox and runs the build before a PR reaches review. Itaú reports a 6x faster .NET to Java migration of 59 services (https://devin.ai/customers/itau).</w:t>
             </w:r>
           </w:p>
           <w:p>
@@ -4255,7 +4210,7 @@
                 <w:color w:val="1F2937"/>
                 <w:sz w:val="22"/>
               </w:rPr>
-              <w:t>Is it worth a 20 minute look at one repo together?</w:t>
+              <w:t>Can we find 20 minutes to chat?</w:t>
             </w:r>
           </w:p>
           <w:p>
@@ -4315,7 +4270,7 @@
                 <w:color w:val="1F2937"/>
                 <w:sz w:val="20"/>
               </w:rPr>
-              <w:t>Hi Adam, your note on agent tooling that cut build failures at Stripe caught my eye. I work with developer productivity teams on where coding agents fit next and would be glad to connect.</w:t>
+              <w:t>Hi Adam, your note on agent tooling that cut build failures at Stripe caught my eye. I work with developer productivity teams on where coding agents fit next and would love to connect.</w:t>
             </w:r>
           </w:p>
           <w:p>
@@ -4345,7 +4300,7 @@
                 <w:color w:val="1F2937"/>
                 <w:sz w:val="20"/>
               </w:rPr>
-              <w:t>Thanks for connecting, Adam. Teams that have already wired agents into build and CI usually find the next bottleneck is the change work itself: library upgrades, schema changes rippling across services, and cleanup nobody schedules. Devin picks up that kind of ticket, works in an isolated environment, runs the build and tests, and opens a PR for normal review. If you have an upgrade or schema migration sitting in the backlog, I'd be glad to walk through how a first run on it would look. Worth a short call?</w:t>
+              <w:t>Thanks for connecting, Adam. Teams that have already wired agents into build and CI usually find the next bottleneck is the change work itself, especially schema changes that ripple across services. Devin picks up that kind of ticket in an isolated environment and opens a PR only after the build and tests pass, so review stays normal. If you have an upgrade or schema migration sitting in the backlog, that's a good first run. Open to a quick chat?</w:t>
             </w:r>
           </w:p>
           <w:tbl>
@@ -4402,7 +4357,7 @@
                       <w:color w:val="6B7280"/>
                       <w:sz w:val="16"/>
                     </w:rPr>
-                    <w:t>- Technical evaluator: hook is his own profile line on agent tooling results, so keep it about his stack</w:t>
+                    <w:t>- Never position Devin as replacing Claude Code or Minions; frame it as next-layer work</w:t>
                   </w:r>
                 </w:p>
                 <w:p>
@@ -4417,22 +4372,7 @@
                       <w:color w:val="6B7280"/>
                       <w:sz w:val="16"/>
                     </w:rPr>
-                    <w:t>- Claude Code and Minions are in production; position as next-layer work, never replacement</w:t>
-                  </w:r>
-                </w:p>
-                <w:p>
-                  <w:pPr>
-                    <w:spacing w:before="0" w:after="8" w:line="269" w:lineRule="auto"/>
-                  </w:pPr>
-                  <w:r>
-                    <w:rPr>
-                      <w:rFonts w:ascii="Arial" w:hAnsi="Arial" w:cs="Arial" w:eastAsia="Arial"/>
-                      <w:b w:val="0"/>
-                      <w:i w:val="0"/>
-                      <w:color w:val="6B7280"/>
-                      <w:sz w:val="16"/>
-                    </w:rPr>
-                    <w:t>- Hook comes from his profile, not a post; keep the tone light</w:t>
+                    <w:t>- Keep it about his stack; the hook is his own profile line, so keep the tone light</w:t>
                   </w:r>
                 </w:p>
                 <w:p>

</xml_diff>